<commit_message>
Add Endpoints ativar-desativar-login-logout (realizarAjustes)
</commit_message>
<xml_diff>
--- a/Docs/DRS_LES_2_2026COMCOMENTARIOS.docx
+++ b/Docs/DRS_LES_2_2026COMCOMENTARIOS.docx
@@ -4758,7 +4758,37 @@
                 <w:szCs w:val="20"/>
                 <w:highlight w:val="green"/>
               </w:rPr>
-              <w:t>A senha cadastrada pelo usuário deve ser composta de pelo menos 8 caracteres, ter letras maiúsculas e minúsculas além de conter caracteres especiais.</w:t>
+              <w:t xml:space="preserve">A senha cadastrada pelo usuário deve ser composta de pelo menos 8 caracteres, ter letras maiúsculas e minúsculas além de conter caracteres </w:t>
+            </w:r>
+            <w:commentRangeStart w:id="0"/>
+            <w:r>
+              <w:rPr>
+                <w:color w:val="auto"/>
+                <w:sz w:val="20"/>
+                <w:szCs w:val="20"/>
+                <w:highlight w:val="green"/>
+              </w:rPr>
+              <w:t>especiais</w:t>
+            </w:r>
+            <w:commentRangeEnd w:id="0"/>
+            <w:r>
+              <w:rPr>
+                <w:rStyle w:val="Refdecomentrio"/>
+                <w:color w:val="auto"/>
+                <w:sz w:val="20"/>
+                <w:szCs w:val="20"/>
+                <w:highlight w:val="green"/>
+              </w:rPr>
+              <w:commentReference w:id="0"/>
+            </w:r>
+            <w:r>
+              <w:rPr>
+                <w:color w:val="auto"/>
+                <w:sz w:val="20"/>
+                <w:szCs w:val="20"/>
+                <w:highlight w:val="green"/>
+              </w:rPr>
+              <w:t>.</w:t>
             </w:r>
           </w:p>
         </w:tc>
@@ -4832,7 +4862,34 @@
                 <w:szCs w:val="20"/>
                 <w:highlight w:val="green"/>
               </w:rPr>
-              <w:t>O usuário obrigatoriamente deve digitar duas vezes a mesma senha no momento do registro da mesma.</w:t>
+              <w:t xml:space="preserve">O usuário obrigatoriamente deve digitar duas vezes a mesma senha no momento do registro da </w:t>
+            </w:r>
+            <w:commentRangeStart w:id="1"/>
+            <w:r>
+              <w:rPr>
+                <w:sz w:val="20"/>
+                <w:szCs w:val="20"/>
+                <w:highlight w:val="green"/>
+              </w:rPr>
+              <w:t>mesma</w:t>
+            </w:r>
+            <w:commentRangeEnd w:id="1"/>
+            <w:r>
+              <w:rPr>
+                <w:rStyle w:val="Refdecomentrio"/>
+                <w:sz w:val="20"/>
+                <w:szCs w:val="20"/>
+                <w:highlight w:val="green"/>
+              </w:rPr>
+              <w:commentReference w:id="1"/>
+            </w:r>
+            <w:r>
+              <w:rPr>
+                <w:sz w:val="20"/>
+                <w:szCs w:val="20"/>
+                <w:highlight w:val="green"/>
+              </w:rPr>
+              <w:t>.</w:t>
             </w:r>
           </w:p>
         </w:tc>
@@ -5062,7 +5119,34 @@
                 <w:szCs w:val="20"/>
                 <w:highlight w:val="green"/>
               </w:rPr>
-              <w:t>Todo cliente cadastrado deve receber um código único no sistema.</w:t>
+              <w:t xml:space="preserve">Todo cliente cadastrado deve receber um código único no </w:t>
+            </w:r>
+            <w:commentRangeStart w:id="2"/>
+            <w:r>
+              <w:rPr>
+                <w:sz w:val="20"/>
+                <w:szCs w:val="20"/>
+                <w:highlight w:val="green"/>
+              </w:rPr>
+              <w:t>sistema</w:t>
+            </w:r>
+            <w:commentRangeEnd w:id="2"/>
+            <w:r>
+              <w:rPr>
+                <w:rStyle w:val="Refdecomentrio"/>
+                <w:sz w:val="20"/>
+                <w:szCs w:val="20"/>
+                <w:highlight w:val="green"/>
+              </w:rPr>
+              <w:commentReference w:id="2"/>
+            </w:r>
+            <w:r>
+              <w:rPr>
+                <w:sz w:val="20"/>
+                <w:szCs w:val="20"/>
+                <w:highlight w:val="green"/>
+              </w:rPr>
+              <w:t>.</w:t>
             </w:r>
           </w:p>
           <w:p>
@@ -8685,7 +8769,7 @@
                 <w:szCs w:val="20"/>
               </w:rPr>
             </w:pPr>
-            <w:commentRangeStart w:id="0"/>
+            <w:commentRangeStart w:id="3"/>
             <w:r>
               <w:rPr>
                 <w:sz w:val="20"/>
@@ -8693,14 +8777,14 @@
               </w:rPr>
               <w:t>Também deve ser validado o aceite da compra pela respectiva operadora de cartão de crédito.</w:t>
             </w:r>
-            <w:commentRangeEnd w:id="0"/>
+            <w:commentRangeEnd w:id="3"/>
             <w:r>
               <w:rPr>
                 <w:rStyle w:val="Refdecomentrio"/>
                 <w:sz w:val="20"/>
                 <w:szCs w:val="20"/>
               </w:rPr>
-              <w:commentReference w:id="0"/>
+              <w:commentReference w:id="3"/>
             </w:r>
           </w:p>
         </w:tc>
@@ -10942,7 +11026,55 @@
 
 <file path=word/comments.xml><?xml version="1.0" encoding="utf-8"?>
 <w:comments xmlns:wpc="http://schemas.microsoft.com/office/word/2010/wordprocessingCanvas" xmlns:cx="http://schemas.microsoft.com/office/drawing/2014/chartex" xmlns:cx1="http://schemas.microsoft.com/office/drawing/2015/9/8/chartex" xmlns:cx2="http://schemas.microsoft.com/office/drawing/2015/10/21/chartex" xmlns:cx3="http://schemas.microsoft.com/office/drawing/2016/5/9/chartex" xmlns:cx4="http://schemas.microsoft.com/office/drawing/2016/5/10/chartex" xmlns:cx5="http://schemas.microsoft.com/office/drawing/2016/5/11/chartex" xmlns:cx6="http://schemas.microsoft.com/office/drawing/2016/5/12/chartex" xmlns:cx7="http://schemas.microsoft.com/office/drawing/2016/5/13/chartex" xmlns:cx8="http://schemas.microsoft.com/office/drawing/2016/5/14/chartex" xmlns:mc="http://schemas.openxmlformats.org/markup-compatibility/2006" xmlns:aink="http://schemas.microsoft.com/office/drawing/2016/ink" xmlns:am3d="http://schemas.microsoft.com/office/drawing/2017/model3d" xmlns:o="urn:schemas-microsoft-com:office:office" xmlns:oel="http://schemas.microsoft.com/office/2019/extlst" xmlns:r="http://schemas.openxmlformats.org/officeDocument/2006/relationships" xmlns:m="http://schemas.openxmlformats.org/officeDocument/2006/math" xmlns:v="urn:schemas-microsoft-com:vml" xmlns:wp14="http://schemas.microsoft.com/office/word/2010/wordprocessingDrawing" xmlns:wp="http://schemas.openxmlformats.org/drawingml/2006/wordprocessingDrawing" xmlns:w10="urn:schemas-microsoft-com:office:word" xmlns:w="http://schemas.openxmlformats.org/wordprocessingml/2006/main" xmlns:w14="http://schemas.microsoft.com/office/word/2010/wordml" xmlns:w15="http://schemas.microsoft.com/office/word/2012/wordml" xmlns:w16cei="http://schemas.microsoft.com/office/word/2026/wordml/cei" xmlns:w16cex="http://schemas.microsoft.com/office/word/2018/wordml/cex" xmlns:w16cid="http://schemas.microsoft.com/office/word/2016/wordml/cid" xmlns:w16="http://schemas.microsoft.com/office/word/2018/wordml" xmlns:w16du="http://schemas.microsoft.com/office/word/2023/wordml/word16du" xmlns:w16sdtdh="http://schemas.microsoft.com/office/word/2020/wordml/sdtdatahash" xmlns:w16sdtfl="http://schemas.microsoft.com/office/word/2024/wordml/sdtformatlock" xmlns:w16se="http://schemas.microsoft.com/office/word/2015/wordml/symex" xmlns:wpg="http://schemas.microsoft.com/office/word/2010/wordprocessingGroup" xmlns:wpi="http://schemas.microsoft.com/office/word/2010/wordprocessingInk" xmlns:wne="http://schemas.microsoft.com/office/word/2006/wordml" xmlns:wps="http://schemas.microsoft.com/office/word/2010/wordprocessingShape" mc:Ignorable="w14 w15 w16se w16cid w16 w16cex w16sdtdh w16sdtfl w16du wp14">
-  <w:comment w:id="0" w:author="Fatec" w:date="2017-10-30T20:03:00Z" w:initials="F">
+  <w:comment w:id="0" w:author="LUCAS JOSE DE ALMEIDA MOURA" w:date="2026-08-18T09:06:00Z" w:initials="LM">
+    <w:p>
+      <w:pPr>
+        <w:pStyle w:val="Textodecomentrio"/>
+      </w:pPr>
+      <w:r>
+        <w:rPr>
+          <w:rStyle w:val="Refdecomentrio"/>
+        </w:rPr>
+        <w:annotationRef/>
+      </w:r>
+      <w:r>
+        <w:t>Adicionado no endpoint create para cliente e na DTO ClienteCreateDTO, assim não precisa passar na service e validar para que não demore tempo de requisiçao e já retorne 400. Adicionar futuramente um validator para senha, quando for adicionado novos endpoints (exemplo AlterarSenha) Seja validado na service.</w:t>
+      </w:r>
+    </w:p>
+  </w:comment>
+  <w:comment w:id="1" w:author="LUCAS JOSE DE ALMEIDA MOURA" w:date="2026-08-18T09:07:00Z" w:initials="LM">
+    <w:p>
+      <w:pPr>
+        <w:pStyle w:val="Textodecomentrio"/>
+      </w:pPr>
+      <w:r>
+        <w:rPr>
+          <w:rStyle w:val="Refdecomentrio"/>
+        </w:rPr>
+        <w:annotationRef/>
+      </w:r>
+      <w:r>
+        <w:t>Já adicionado na DTO ClienteCreateDTO na DataAnnotation.</w:t>
+      </w:r>
+    </w:p>
+  </w:comment>
+  <w:comment w:id="2" w:author="LUCAS JOSE DE ALMEIDA MOURA" w:date="2026-08-18T09:09:00Z" w:initials="LM">
+    <w:p>
+      <w:pPr>
+        <w:pStyle w:val="Textodecomentrio"/>
+      </w:pPr>
+      <w:r>
+        <w:rPr>
+          <w:rStyle w:val="Refdecomentrio"/>
+        </w:rPr>
+        <w:annotationRef/>
+      </w:r>
+      <w:r>
+        <w:t>GUID IdCliente</w:t>
+      </w:r>
+    </w:p>
+  </w:comment>
+  <w:comment w:id="3" w:author="Fatec" w:date="2017-10-30T20:03:00Z" w:initials="F">
     <w:p>
       <w:pPr>
         <w:pStyle w:val="Textodecomentrio"/>
@@ -10981,12 +11113,26 @@
 
 <file path=word/commentsExtended.xml><?xml version="1.0" encoding="utf-8"?>
 <w15:commentsEx xmlns:wpc="http://schemas.microsoft.com/office/word/2010/wordprocessingCanvas" xmlns:cx="http://schemas.microsoft.com/office/drawing/2014/chartex" xmlns:cx1="http://schemas.microsoft.com/office/drawing/2015/9/8/chartex" xmlns:cx2="http://schemas.microsoft.com/office/drawing/2015/10/21/chartex" xmlns:cx3="http://schemas.microsoft.com/office/drawing/2016/5/9/chartex" xmlns:cx4="http://schemas.microsoft.com/office/drawing/2016/5/10/chartex" xmlns:cx5="http://schemas.microsoft.com/office/drawing/2016/5/11/chartex" xmlns:cx6="http://schemas.microsoft.com/office/drawing/2016/5/12/chartex" xmlns:cx7="http://schemas.microsoft.com/office/drawing/2016/5/13/chartex" xmlns:cx8="http://schemas.microsoft.com/office/drawing/2016/5/14/chartex" xmlns:mc="http://schemas.openxmlformats.org/markup-compatibility/2006" xmlns:aink="http://schemas.microsoft.com/office/drawing/2016/ink" xmlns:am3d="http://schemas.microsoft.com/office/drawing/2017/model3d" xmlns:o="urn:schemas-microsoft-com:office:office" xmlns:oel="http://schemas.microsoft.com/office/2019/extlst" xmlns:r="http://schemas.openxmlformats.org/officeDocument/2006/relationships" xmlns:m="http://schemas.openxmlformats.org/officeDocument/2006/math" xmlns:v="urn:schemas-microsoft-com:vml" xmlns:wp14="http://schemas.microsoft.com/office/word/2010/wordprocessingDrawing" xmlns:wp="http://schemas.openxmlformats.org/drawingml/2006/wordprocessingDrawing" xmlns:w10="urn:schemas-microsoft-com:office:word" xmlns:w="http://schemas.openxmlformats.org/wordprocessingml/2006/main" xmlns:w14="http://schemas.microsoft.com/office/word/2010/wordml" xmlns:w15="http://schemas.microsoft.com/office/word/2012/wordml" xmlns:w16cei="http://schemas.microsoft.com/office/word/2026/wordml/cei" xmlns:w16cex="http://schemas.microsoft.com/office/word/2018/wordml/cex" xmlns:w16cid="http://schemas.microsoft.com/office/word/2016/wordml/cid" xmlns:w16="http://schemas.microsoft.com/office/word/2018/wordml" xmlns:w16du="http://schemas.microsoft.com/office/word/2023/wordml/word16du" xmlns:w16sdtdh="http://schemas.microsoft.com/office/word/2020/wordml/sdtdatahash" xmlns:w16sdtfl="http://schemas.microsoft.com/office/word/2024/wordml/sdtformatlock" xmlns:w16se="http://schemas.microsoft.com/office/word/2015/wordml/symex" xmlns:wpg="http://schemas.microsoft.com/office/word/2010/wordprocessingGroup" xmlns:wpi="http://schemas.microsoft.com/office/word/2010/wordprocessingInk" xmlns:wne="http://schemas.microsoft.com/office/word/2006/wordml" xmlns:wps="http://schemas.microsoft.com/office/word/2010/wordprocessingShape" mc:Ignorable="w14 w15 w16se w16cid w16 w16cex w16sdtdh w16sdtfl w16du wp14">
+  <w15:commentEx w15:paraId="06EA1F77" w15:done="0"/>
+  <w15:commentEx w15:paraId="0E76F454" w15:done="0"/>
+  <w15:commentEx w15:paraId="3437F3A5" w15:done="0"/>
   <w15:commentEx w15:paraId="2BAEB5B3" w15:done="0"/>
 </w15:commentsEx>
 </file>
 
+<file path=word/commentsExtensible.xml><?xml version="1.0" encoding="utf-8"?>
+<w16cex:commentsExtensible xmlns:wpc="http://schemas.microsoft.com/office/word/2010/wordprocessingCanvas" xmlns:cx="http://schemas.microsoft.com/office/drawing/2014/chartex" xmlns:cx1="http://schemas.microsoft.com/office/drawing/2015/9/8/chartex" xmlns:cx2="http://schemas.microsoft.com/office/drawing/2015/10/21/chartex" xmlns:cx3="http://schemas.microsoft.com/office/drawing/2016/5/9/chartex" xmlns:cx4="http://schemas.microsoft.com/office/drawing/2016/5/10/chartex" xmlns:cx5="http://schemas.microsoft.com/office/drawing/2016/5/11/chartex" xmlns:cx6="http://schemas.microsoft.com/office/drawing/2016/5/12/chartex" xmlns:cx7="http://schemas.microsoft.com/office/drawing/2016/5/13/chartex" xmlns:cx8="http://schemas.microsoft.com/office/drawing/2016/5/14/chartex" xmlns:cr="http://schemas.microsoft.com/office/comments/2020/reactions" xmlns:mc="http://schemas.openxmlformats.org/markup-compatibility/2006" xmlns:aink="http://schemas.microsoft.com/office/drawing/2016/ink" xmlns:am3d="http://schemas.microsoft.com/office/drawing/2017/model3d" xmlns:o="urn:schemas-microsoft-com:office:office" xmlns:oel="http://schemas.microsoft.com/office/2019/extlst" xmlns:r="http://schemas.openxmlformats.org/officeDocument/2006/relationships" xmlns:m="http://schemas.openxmlformats.org/officeDocument/2006/math" xmlns:v="urn:schemas-microsoft-com:vml" xmlns:wp14="http://schemas.microsoft.com/office/word/2010/wordprocessingDrawing" xmlns:wp="http://schemas.openxmlformats.org/drawingml/2006/wordprocessingDrawing" xmlns:w10="urn:schemas-microsoft-com:office:word" xmlns:w="http://schemas.openxmlformats.org/wordprocessingml/2006/main" xmlns:w14="http://schemas.microsoft.com/office/word/2010/wordml" xmlns:w15="http://schemas.microsoft.com/office/word/2012/wordml" xmlns:w16cei="http://schemas.microsoft.com/office/word/2026/wordml/cei" xmlns:w16cex="http://schemas.microsoft.com/office/word/2018/wordml/cex" xmlns:w16cid="http://schemas.microsoft.com/office/word/2016/wordml/cid" xmlns:w16="http://schemas.microsoft.com/office/word/2018/wordml" xmlns:w16du="http://schemas.microsoft.com/office/word/2023/wordml/word16du" xmlns:w16sdtdh="http://schemas.microsoft.com/office/word/2020/wordml/sdtdatahash" xmlns:w16sdtfl="http://schemas.microsoft.com/office/word/2024/wordml/sdtformatlock" xmlns:w16se="http://schemas.microsoft.com/office/word/2015/wordml/symex" xmlns:wpg="http://schemas.microsoft.com/office/word/2010/wordprocessingGroup" xmlns:wpi="http://schemas.microsoft.com/office/word/2010/wordprocessingInk" xmlns:wne="http://schemas.microsoft.com/office/word/2006/wordml" xmlns:wps="http://schemas.microsoft.com/office/word/2010/wordprocessingShape" mc:Ignorable="w14 w15 w16se w16cid w16 w16cex w16sdtdh w16sdtfl cr w16du wp14">
+  <w16cex:commentExtensible w16cex:durableId="48841518" w16cex:dateUtc="2026-08-18T12:06:00Z"/>
+  <w16cex:commentExtensible w16cex:durableId="0C60679E" w16cex:dateUtc="2026-08-18T12:07:00Z"/>
+  <w16cex:commentExtensible w16cex:durableId="06226FC5" w16cex:dateUtc="2026-08-18T12:09:00Z"/>
+</w16cex:commentsExtensible>
+</file>
+
 <file path=word/commentsIds.xml><?xml version="1.0" encoding="utf-8"?>
 <w16cid:commentsIds xmlns:wpc="http://schemas.microsoft.com/office/word/2010/wordprocessingCanvas" xmlns:cx="http://schemas.microsoft.com/office/drawing/2014/chartex" xmlns:cx1="http://schemas.microsoft.com/office/drawing/2015/9/8/chartex" xmlns:cx2="http://schemas.microsoft.com/office/drawing/2015/10/21/chartex" xmlns:cx3="http://schemas.microsoft.com/office/drawing/2016/5/9/chartex" xmlns:cx4="http://schemas.microsoft.com/office/drawing/2016/5/10/chartex" xmlns:cx5="http://schemas.microsoft.com/office/drawing/2016/5/11/chartex" xmlns:cx6="http://schemas.microsoft.com/office/drawing/2016/5/12/chartex" xmlns:cx7="http://schemas.microsoft.com/office/drawing/2016/5/13/chartex" xmlns:cx8="http://schemas.microsoft.com/office/drawing/2016/5/14/chartex" xmlns:mc="http://schemas.openxmlformats.org/markup-compatibility/2006" xmlns:aink="http://schemas.microsoft.com/office/drawing/2016/ink" xmlns:am3d="http://schemas.microsoft.com/office/drawing/2017/model3d" xmlns:o="urn:schemas-microsoft-com:office:office" xmlns:oel="http://schemas.microsoft.com/office/2019/extlst" xmlns:r="http://schemas.openxmlformats.org/officeDocument/2006/relationships" xmlns:m="http://schemas.openxmlformats.org/officeDocument/2006/math" xmlns:v="urn:schemas-microsoft-com:vml" xmlns:wp14="http://schemas.microsoft.com/office/word/2010/wordprocessingDrawing" xmlns:wp="http://schemas.openxmlformats.org/drawingml/2006/wordprocessingDrawing" xmlns:w10="urn:schemas-microsoft-com:office:word" xmlns:w="http://schemas.openxmlformats.org/wordprocessingml/2006/main" xmlns:w14="http://schemas.microsoft.com/office/word/2010/wordml" xmlns:w15="http://schemas.microsoft.com/office/word/2012/wordml" xmlns:w16cei="http://schemas.microsoft.com/office/word/2026/wordml/cei" xmlns:w16cex="http://schemas.microsoft.com/office/word/2018/wordml/cex" xmlns:w16cid="http://schemas.microsoft.com/office/word/2016/wordml/cid" xmlns:w16="http://schemas.microsoft.com/office/word/2018/wordml" xmlns:w16du="http://schemas.microsoft.com/office/word/2023/wordml/word16du" xmlns:w16sdtdh="http://schemas.microsoft.com/office/word/2020/wordml/sdtdatahash" xmlns:w16sdtfl="http://schemas.microsoft.com/office/word/2024/wordml/sdtformatlock" xmlns:w16se="http://schemas.microsoft.com/office/word/2015/wordml/symex" xmlns:wpg="http://schemas.microsoft.com/office/word/2010/wordprocessingGroup" xmlns:wpi="http://schemas.microsoft.com/office/word/2010/wordprocessingInk" xmlns:wne="http://schemas.microsoft.com/office/word/2006/wordml" xmlns:wps="http://schemas.microsoft.com/office/word/2010/wordprocessingShape" mc:Ignorable="w14 w15 w16se w16cid w16 w16cex w16sdtdh w16sdtfl w16du wp14">
+  <w16cid:commentId w16cid:paraId="06EA1F77" w16cid:durableId="48841518"/>
+  <w16cid:commentId w16cid:paraId="0E76F454" w16cid:durableId="0C60679E"/>
+  <w16cid:commentId w16cid:paraId="3437F3A5" w16cid:durableId="06226FC5"/>
   <w16cid:commentId w16cid:paraId="2BAEB5B3" w16cid:durableId="1E2EE477"/>
 </w16cid:commentsIds>
 </file>
@@ -11823,6 +11969,9 @@
 
 <file path=word/people.xml><?xml version="1.0" encoding="utf-8"?>
 <w15:people xmlns:wpc="http://schemas.microsoft.com/office/word/2010/wordprocessingCanvas" xmlns:cx="http://schemas.microsoft.com/office/drawing/2014/chartex" xmlns:cx1="http://schemas.microsoft.com/office/drawing/2015/9/8/chartex" xmlns:cx2="http://schemas.microsoft.com/office/drawing/2015/10/21/chartex" xmlns:cx3="http://schemas.microsoft.com/office/drawing/2016/5/9/chartex" xmlns:cx4="http://schemas.microsoft.com/office/drawing/2016/5/10/chartex" xmlns:cx5="http://schemas.microsoft.com/office/drawing/2016/5/11/chartex" xmlns:cx6="http://schemas.microsoft.com/office/drawing/2016/5/12/chartex" xmlns:cx7="http://schemas.microsoft.com/office/drawing/2016/5/13/chartex" xmlns:cx8="http://schemas.microsoft.com/office/drawing/2016/5/14/chartex" xmlns:mc="http://schemas.openxmlformats.org/markup-compatibility/2006" xmlns:aink="http://schemas.microsoft.com/office/drawing/2016/ink" xmlns:am3d="http://schemas.microsoft.com/office/drawing/2017/model3d" xmlns:o="urn:schemas-microsoft-com:office:office" xmlns:oel="http://schemas.microsoft.com/office/2019/extlst" xmlns:r="http://schemas.openxmlformats.org/officeDocument/2006/relationships" xmlns:m="http://schemas.openxmlformats.org/officeDocument/2006/math" xmlns:v="urn:schemas-microsoft-com:vml" xmlns:wp14="http://schemas.microsoft.com/office/word/2010/wordprocessingDrawing" xmlns:wp="http://schemas.openxmlformats.org/drawingml/2006/wordprocessingDrawing" xmlns:w10="urn:schemas-microsoft-com:office:word" xmlns:w="http://schemas.openxmlformats.org/wordprocessingml/2006/main" xmlns:w14="http://schemas.microsoft.com/office/word/2010/wordml" xmlns:w15="http://schemas.microsoft.com/office/word/2012/wordml" xmlns:w16cei="http://schemas.microsoft.com/office/word/2026/wordml/cei" xmlns:w16cex="http://schemas.microsoft.com/office/word/2018/wordml/cex" xmlns:w16cid="http://schemas.microsoft.com/office/word/2016/wordml/cid" xmlns:w16="http://schemas.microsoft.com/office/word/2018/wordml" xmlns:w16du="http://schemas.microsoft.com/office/word/2023/wordml/word16du" xmlns:w16sdtdh="http://schemas.microsoft.com/office/word/2020/wordml/sdtdatahash" xmlns:w16sdtfl="http://schemas.microsoft.com/office/word/2024/wordml/sdtformatlock" xmlns:w16se="http://schemas.microsoft.com/office/word/2015/wordml/symex" xmlns:wpg="http://schemas.microsoft.com/office/word/2010/wordprocessingGroup" xmlns:wpi="http://schemas.microsoft.com/office/word/2010/wordprocessingInk" xmlns:wne="http://schemas.microsoft.com/office/word/2006/wordml" xmlns:wps="http://schemas.microsoft.com/office/word/2010/wordprocessingShape" mc:Ignorable="w14 w15 w16se w16cid w16 w16cex w16sdtdh w16sdtfl w16du wp14">
+  <w15:person w15:author="LUCAS JOSE DE ALMEIDA MOURA">
+    <w15:presenceInfo w15:providerId="AD" w15:userId="S::lucas.moura21@fatec.sp.gov.br::33d989b9-9bd9-4c72-9ed7-76bad53940b8"/>
+  </w15:person>
   <w15:person w15:author="Fatec">
     <w15:presenceInfo w15:providerId="None" w15:userId="Fatec"/>
   </w15:person>
@@ -12480,7 +12629,6 @@
     <w:basedOn w:val="Normal"/>
     <w:link w:val="TextodecomentrioChar"/>
     <w:uiPriority w:val="99"/>
-    <w:semiHidden/>
     <w:unhideWhenUsed/>
     <w:rPr>
       <w:sz w:val="20"/>
@@ -12492,7 +12640,6 @@
     <w:basedOn w:val="Fontepargpadro"/>
     <w:link w:val="Textodecomentrio"/>
     <w:uiPriority w:val="99"/>
-    <w:semiHidden/>
     <w:rPr>
       <w:sz w:val="20"/>
       <w:szCs w:val="20"/>

</xml_diff>